<commit_message>
Rebuild reference with verified dates
</commit_message>
<xml_diff>
--- a/reference_header.docx
+++ b/reference_header.docx
@@ -22,7 +22,65 @@
     </w:p>
     <w:p>
       <w:r>
-        <w:t>This is a reference document used to verify the locked navy/gold header for Troy J. Hokanson's DOCX resumes, cover letters, and CVs. The header above must match the UHG reference exactly: full-bleed navy bar with zero whitespace above, white serif name centered, inset gold horizontal rule, single gold contact row beneath, no subtitle line.</w:t>
+        <w:t>This is a reference document used to verify the locked navy/gold header for Troy J. Hokanson's DOCX resumes, cover letters, and CVs. The header above must match the UHG reference exactly: full-bleed navy bar with zero whitespace above, white serif name centered, inset gold horizontal rule, single gold contact row beneath, no subtitle line. Canonical repository date ranges are University of Phoenix (2007-2025) and investigative service (2010-2011, 2016-2021).</w:t>
+      </w:r>
+    </w:p>
+    <w:p>
+      <w:pPr>
+        <w:spacing w:before="160" w:after="40" w:line="264" w:lineRule="auto"/>
+        <w:pBdr>
+          <w:bottom w:val="single" w:sz="6" w:space="1" w:color="C9A84C"/>
+        </w:pBdr>
+      </w:pPr>
+      <w:r>
+        <w:rPr>
+          <w:rFonts w:ascii="Calibri" w:hAnsi="Calibri" w:cs="Calibri" w:eastAsia="Calibri"/>
+          <w:b/>
+          <w:i w:val="0"/>
+          <w:color w:val="2D6A9F"/>
+          <w:sz w:val="23"/>
+        </w:rPr>
+        <w:t>TEACHING EXPERIENCE</w:t>
+      </w:r>
+    </w:p>
+    <w:p>
+      <w:pPr>
+        <w:spacing w:before="120" w:after="0" w:line="264" w:lineRule="auto"/>
+      </w:pPr>
+      <w:r>
+        <w:rPr>
+          <w:rFonts w:ascii="Calibri" w:hAnsi="Calibri" w:cs="Calibri" w:eastAsia="Calibri"/>
+          <w:b/>
+          <w:i w:val="0"/>
+          <w:color w:val="C9A84C"/>
+          <w:sz w:val="22"/>
+        </w:rPr>
+        <w:t>Adjunct Faculty, Criminal Justice</w:t>
+      </w:r>
+    </w:p>
+    <w:p>
+      <w:pPr>
+        <w:spacing w:before="0" w:after="40" w:line="264" w:lineRule="auto"/>
+      </w:pPr>
+      <w:r>
+        <w:rPr>
+          <w:rFonts w:ascii="Calibri" w:hAnsi="Calibri" w:cs="Calibri" w:eastAsia="Calibri"/>
+          <w:b w:val="0"/>
+          <w:i/>
+          <w:color w:val="141414"/>
+          <w:sz w:val="21"/>
+        </w:rPr>
+        <w:t>University of Phoenix</w:t>
+      </w:r>
+      <w:r>
+        <w:rPr>
+          <w:rFonts w:ascii="Calibri" w:hAnsi="Calibri" w:cs="Calibri" w:eastAsia="Calibri"/>
+          <w:b w:val="0"/>
+          <w:i w:val="0"/>
+          <w:color w:val="555555"/>
+          <w:sz w:val="20"/>
+        </w:rPr>
+        <w:t xml:space="preserve">    2007-2025</w:t>
       </w:r>
     </w:p>
     <w:p>
@@ -41,6 +99,46 @@
           <w:sz w:val="23"/>
         </w:rPr>
         <w:t>PROFESSIONAL EXPERIENCE</w:t>
+      </w:r>
+    </w:p>
+    <w:p>
+      <w:pPr>
+        <w:spacing w:before="120" w:after="0" w:line="264" w:lineRule="auto"/>
+      </w:pPr>
+      <w:r>
+        <w:rPr>
+          <w:rFonts w:ascii="Calibri" w:hAnsi="Calibri" w:cs="Calibri" w:eastAsia="Calibri"/>
+          <w:b/>
+          <w:i w:val="0"/>
+          <w:color w:val="C9A84C"/>
+          <w:sz w:val="22"/>
+        </w:rPr>
+        <w:t>Investigative Service Sample</w:t>
+      </w:r>
+    </w:p>
+    <w:p>
+      <w:pPr>
+        <w:spacing w:before="0" w:after="40" w:line="264" w:lineRule="auto"/>
+      </w:pPr>
+      <w:r>
+        <w:rPr>
+          <w:rFonts w:ascii="Calibri" w:hAnsi="Calibri" w:cs="Calibri" w:eastAsia="Calibri"/>
+          <w:b w:val="0"/>
+          <w:i/>
+          <w:color w:val="141414"/>
+          <w:sz w:val="21"/>
+        </w:rPr>
+        <w:t>Reference chronology verification entry</w:t>
+      </w:r>
+      <w:r>
+        <w:rPr>
+          <w:rFonts w:ascii="Calibri" w:hAnsi="Calibri" w:cs="Calibri" w:eastAsia="Calibri"/>
+          <w:b w:val="0"/>
+          <w:i w:val="0"/>
+          <w:color w:val="555555"/>
+          <w:sz w:val="20"/>
+        </w:rPr>
+        <w:t xml:space="preserve">    2010-2011</w:t>
       </w:r>
     </w:p>
     <w:p>
@@ -80,7 +178,7 @@
           <w:color w:val="555555"/>
           <w:sz w:val="20"/>
         </w:rPr>
-        <w:t xml:space="preserve">    September 2016 - December 2021</w:t>
+        <w:t xml:space="preserve">    2016-2021</w:t>
       </w:r>
     </w:p>
     <w:p>

</xml_diff>